<commit_message>
docs: revised report sections and LR2.1 notebook (round 2)
LR2.2 section by Luke Ren: all eight explanatory variables now tabulated with their selection status, and both the full and the reduced regression equations written out. LR2.1 section and notebook by Peng Song: states explicitly that 'strength' combines two of the eight original variables and is not a ninth variable. Committed by Sihao Cui while consolidating the report.
</commit_message>
<xml_diff>
--- a/docs/lr21_report_section_peng.docx
+++ b/docs/lr21_report_section_peng.docx
@@ -86,7 +86,7 @@
           <w:i w:val="0"/>
           <w:sz w:val="20"/>
         </w:rPr>
-        <w:t>All models were scored on identical folds by repeated 10-fold cross-validation (30 repeats, nested tuning) and by a walk-forward test that forecasts each stage from earlier ones (80 forecasts). The full 8-variable OLS (adjusted R² 0.48) has a CV RMSE of 1.55 but 1.82 in walk-forward, worse than a rank-only regression (1.55), because it learns the listing artefact. Two EDA-driven changes fixed this: a strength index (mean of the two log differences; equal weights not rejected, p = 0.59) and a symmetric specification with no intercept. Of the other variables only host advantage lowered both errors. Twenty models were compared (Table 2.1, Figure 2.1c): ridge, lasso, elastic net, Huber, PCR, PLS, best-subset selection and tree ensembles, plain and symmetrised, all lost to the two-term model on both tests.</w:t>
+        <w:t>All models were scored on identical folds by repeated 10-fold cross-validation (30 repeats, nested tuning) and by a walk-forward test that forecasts each stage from earlier ones (80 forecasts). The full 8-variable OLS (adjusted R² 0.48) has a CV RMSE of 1.55 but 1.82 in walk-forward, worse than a rank-only regression (1.55), because it learns the listing artefact. Two EDA-driven changes fixed this: a strength index, the mean of the two log differences (equal weights not rejected, p = 0.59), and a symmetric specification with no intercept. Of the other variables only host advantage lowered both errors. All twenty competing models (Table 2.1, Figure 2.1c), including ridge, lasso, elastic net, Huber, PCR, PLS, best subset and tree ensembles, lost to the two-term model on both tests.</w:t>
       </w:r>
     </w:p>
     <w:p>
@@ -110,7 +110,7 @@
           <w:i/>
           <w:sz w:val="20"/>
         </w:rPr>
-        <w:t>goal_diff = 0.90 × strength + 0.82 × host</w:t>
+        <w:t>goal_diff = 0.90 × strength + 0.82 × host_home_diff</w:t>
       </w:r>
       <w:r>
         <w:rPr>
@@ -119,7 +119,7 @@
           <w:i w:val="0"/>
           <w:sz w:val="20"/>
         </w:rPr>
-        <w:t>. CV RMSE falls 3.7% to 1.49 and walk-forward RMSE 21% to 1.43 (bootstrap 95% CI of the difference −0.59 to −0.18). Doubling a team’s rank and value advantage is worth 0.63 goals. The strength coefficient is precise (95% CI 0.72–1.09) and stays within 0.83–0.99 under four robustness checks, including refits on the matches played after the squad values were published; the host effect rests on 13 matches and is uncertain (HC3 p = 0.12, date-clustered p = 0.06). Residuals pass normality, constant-variance and linearity tests (Shapiro–Wilk p = 0.48, Breusch–Pagan p = 0.17, RESET p = 0.35).</w:t>
+        <w:t>, where strength = (log_rank_diff + log_value_diff)/2: two of the original variables combined with equal weights, not a ninth variable, so the model uses three of the eight. CV RMSE falls 3.7% to 1.49 and walk-forward RMSE 21% to 1.43 (bootstrap 95% CI of the gain −0.59 to −0.18). Doubling a team’s rank and value advantage is worth 0.63 goals. The strength coefficient is precise (95% CI 0.72–1.09) and stays within 0.83–0.99 under four robustness checks, including a refit on matches after squad values were published; the host effect rests on 13 matches and is uncertain (HC3 p = 0.12, date-clustered p = 0.06). Residuals pass normality, equal-variance and linearity tests (Shapiro–Wilk p = 0.48, Breusch–Pagan p = 0.17, RESET p = 0.35).</w:t>
       </w:r>
     </w:p>
     <w:p>
@@ -143,7 +143,7 @@
           <w:i w:val="0"/>
           <w:sz w:val="20"/>
         </w:rPr>
-        <w:t>With the last 16 matches held out, every conventional eight-variable model did worse than an always-draw forecast (1.64) and the symmetric models better; the host term did not help there. The 95% prediction interval is ±2.9 goals (90% coverage): pre-match data explain under half of the variance. We recommend the symmetric two-term model, with the weighted symmetric ridge as the fallback if all eight variables must stay. Random CV alone did not expose the full model’s weakness, so validate chronologically too.</w:t>
+        <w:t>With the last 16 matches held out, every conventional eight-variable model did worse than an always-draw forecast (1.64) and the symmetric models better; the host term did not help there. The 95% prediction interval is ±2.9 goals (90% coverage): pre-match data explain under half of the variance. We recommend the symmetric two-term model, with the weighted symmetric ridge as the fallback if all eight variables must stay. Random CV alone hid the full model’s weakness; validate chronologically too.</w:t>
       </w:r>
     </w:p>
     <w:p>
@@ -154,7 +154,7 @@
       <w:r>
         <w:drawing>
           <wp:inline xmlns:a="http://schemas.openxmlformats.org/drawingml/2006/main" xmlns:pic="http://schemas.openxmlformats.org/drawingml/2006/picture">
-            <wp:extent cx="5724144" cy="1934679"/>
+            <wp:extent cx="5323453" cy="1799251"/>
             <wp:docPr id="1" name="Picture 1"/>
             <wp:cNvGraphicFramePr>
               <a:graphicFrameLocks noChangeAspect="1"/>
@@ -175,7 +175,7 @@
                   <pic:spPr>
                     <a:xfrm>
                       <a:off x="0" y="0"/>
-                      <a:ext cx="5724144" cy="1934679"/>
+                      <a:ext cx="5323453" cy="1799251"/>
                     </a:xfrm>
                     <a:prstGeom prst="rect"/>
                   </pic:spPr>

</xml_diff>